<commit_message>
docs(practica7): mejorar leyendas de evidencias
</commit_message>
<xml_diff>
--- a/practica7/evidencias/Reporte_Practica_07_Paginacion_Filtros.docx
+++ b/practica7/evidencias/Reporte_Practica_07_Paginacion_Filtros.docx
@@ -387,7 +387,7 @@
         <w:drawing>
           <wp:inline xmlns:a="http://schemas.openxmlformats.org/drawingml/2006/main" xmlns:pic="http://schemas.openxmlformats.org/drawingml/2006/picture">
             <wp:extent cx="5577840" cy="10268648"/>
-            <wp:docPr id="1" name="Picture 1"/>
+            <wp:docPr id="1" name="Figura 1. Catalogo inicial de productos."/>
             <wp:cNvGraphicFramePr>
               <a:graphicFrameLocks noChangeAspect="1"/>
             </wp:cNvGraphicFramePr>
@@ -395,7 +395,7 @@
               <a:graphicData uri="http://schemas.openxmlformats.org/drawingml/2006/picture">
                 <pic:pic>
                   <pic:nvPicPr>
-                    <pic:cNvPr id="0" name="practica7_01_catalogo_inicial.png"/>
+                    <pic:cNvPr id="0" name="Figura 1. Catalogo inicial de productos."/>
                     <pic:cNvPicPr/>
                   </pic:nvPicPr>
                   <pic:blipFill>
@@ -430,7 +430,7 @@
           <w:color w:val="505050"/>
           <w:sz w:val="20"/>
         </w:rPr>
-        <w:t>practica7_01_catalogo_inicial.png</w:t>
+        <w:t>Figura 1. Catalogo inicial de productos.</w:t>
       </w:r>
     </w:p>
     <w:p>
@@ -454,7 +454,7 @@
         <w:rPr>
           <w:rFonts w:ascii="Calibri" w:hAnsi="Calibri"/>
         </w:rPr>
-        <w:t>El campo de busqueda contiene el termino 'ab' y el listado se reduce al producto correspondiente, mostrando la sincronizacion del filtro con la vista.</w:t>
+        <w:t>El campo de busqueda contiene el termino 'ab' y el listado se reduce al producto correspondiente.</w:t>
       </w:r>
     </w:p>
     <w:p>
@@ -466,7 +466,7 @@
         <w:drawing>
           <wp:inline xmlns:a="http://schemas.openxmlformats.org/drawingml/2006/main" xmlns:pic="http://schemas.openxmlformats.org/drawingml/2006/picture">
             <wp:extent cx="5577840" cy="10144696"/>
-            <wp:docPr id="2" name="Picture 2"/>
+            <wp:docPr id="2" name="Figura 2. Resultado de busqueda por texto."/>
             <wp:cNvGraphicFramePr>
               <a:graphicFrameLocks noChangeAspect="1"/>
             </wp:cNvGraphicFramePr>
@@ -474,7 +474,7 @@
               <a:graphicData uri="http://schemas.openxmlformats.org/drawingml/2006/picture">
                 <pic:pic>
                   <pic:nvPicPr>
-                    <pic:cNvPr id="0" name="practica7_02_busqueda_ab.png"/>
+                    <pic:cNvPr id="0" name="Figura 2. Resultado de busqueda por texto."/>
                     <pic:cNvPicPr/>
                   </pic:nvPicPr>
                   <pic:blipFill>
@@ -509,7 +509,7 @@
           <w:color w:val="505050"/>
           <w:sz w:val="20"/>
         </w:rPr>
-        <w:t>practica7_02_busqueda_ab.png</w:t>
+        <w:t>Figura 2. Resultado de busqueda por texto.</w:t>
       </w:r>
     </w:p>
     <w:p>
@@ -533,7 +533,7 @@
         <w:rPr>
           <w:rFonts w:ascii="Calibri" w:hAnsi="Calibri"/>
         </w:rPr>
-        <w:t>Se selecciono la categoria 'Hogar' desde el panel lateral para validar el filtrado por categoria desde la API.</w:t>
+        <w:t>Se selecciono la categoria 'Hogar' desde el panel lateral para validar el filtrado por categoria.</w:t>
       </w:r>
     </w:p>
     <w:p>
@@ -545,7 +545,7 @@
         <w:drawing>
           <wp:inline xmlns:a="http://schemas.openxmlformats.org/drawingml/2006/main" xmlns:pic="http://schemas.openxmlformats.org/drawingml/2006/picture">
             <wp:extent cx="5577840" cy="9939401"/>
-            <wp:docPr id="3" name="Picture 3"/>
+            <wp:docPr id="3" name="Figura 3. Aplicacion de filtro por categoria."/>
             <wp:cNvGraphicFramePr>
               <a:graphicFrameLocks noChangeAspect="1"/>
             </wp:cNvGraphicFramePr>
@@ -553,7 +553,7 @@
               <a:graphicData uri="http://schemas.openxmlformats.org/drawingml/2006/picture">
                 <pic:pic>
                   <pic:nvPicPr>
-                    <pic:cNvPr id="0" name="practica7_03_categoria_hogar.png"/>
+                    <pic:cNvPr id="0" name="Figura 3. Aplicacion de filtro por categoria."/>
                     <pic:cNvPicPr/>
                   </pic:nvPicPr>
                   <pic:blipFill>
@@ -588,7 +588,7 @@
           <w:color w:val="505050"/>
           <w:sz w:val="20"/>
         </w:rPr>
-        <w:t>practica7_03_categoria_hogar.png</w:t>
+        <w:t>Figura 3. Aplicacion de filtro por categoria.</w:t>
       </w:r>
     </w:p>
     <w:p>
@@ -624,7 +624,7 @@
         <w:drawing>
           <wp:inline xmlns:a="http://schemas.openxmlformats.org/drawingml/2006/main" xmlns:pic="http://schemas.openxmlformats.org/drawingml/2006/picture">
             <wp:extent cx="5577840" cy="6972300"/>
-            <wp:docPr id="4" name="Picture 4"/>
+            <wp:docPr id="4" name="Figura 4. Aplicacion de filtro por rango de precio."/>
             <wp:cNvGraphicFramePr>
               <a:graphicFrameLocks noChangeAspect="1"/>
             </wp:cNvGraphicFramePr>
@@ -632,7 +632,7 @@
               <a:graphicData uri="http://schemas.openxmlformats.org/drawingml/2006/picture">
                 <pic:pic>
                   <pic:nvPicPr>
-                    <pic:cNvPr id="0" name="practica7_04_rango_precios.png"/>
+                    <pic:cNvPr id="0" name="Figura 4. Aplicacion de filtro por rango de precio."/>
                     <pic:cNvPicPr/>
                   </pic:nvPicPr>
                   <pic:blipFill>
@@ -667,7 +667,7 @@
           <w:color w:val="505050"/>
           <w:sz w:val="20"/>
         </w:rPr>
-        <w:t>practica7_04_rango_precios.png</w:t>
+        <w:t>Figura 4. Aplicacion de filtro por rango de precio.</w:t>
       </w:r>
     </w:p>
     <w:p>
@@ -691,7 +691,7 @@
         <w:rPr>
           <w:rFonts w:ascii="Calibri" w:hAnsi="Calibri"/>
         </w:rPr>
-        <w:t>Se navego a la pagina 2 del catalogo para evidenciar la paginacion server-side y el conteo total de paginas.</w:t>
+        <w:t>Se navego a la pagina 2 del catalogo para mostrar la paginacion server-side y el conteo total de paginas.</w:t>
       </w:r>
     </w:p>
     <w:p>
@@ -703,7 +703,7 @@
         <w:drawing>
           <wp:inline xmlns:a="http://schemas.openxmlformats.org/drawingml/2006/main" xmlns:pic="http://schemas.openxmlformats.org/drawingml/2006/picture">
             <wp:extent cx="5577840" cy="10020744"/>
-            <wp:docPr id="5" name="Picture 5"/>
+            <wp:docPr id="5" name="Figura 5. Navegacion a la pagina 2."/>
             <wp:cNvGraphicFramePr>
               <a:graphicFrameLocks noChangeAspect="1"/>
             </wp:cNvGraphicFramePr>
@@ -711,7 +711,7 @@
               <a:graphicData uri="http://schemas.openxmlformats.org/drawingml/2006/picture">
                 <pic:pic>
                   <pic:nvPicPr>
-                    <pic:cNvPr id="0" name="practica7_05_paginacion_pagina2.png"/>
+                    <pic:cNvPr id="0" name="Figura 5. Navegacion a la pagina 2."/>
                     <pic:cNvPicPr/>
                   </pic:nvPicPr>
                   <pic:blipFill>
@@ -746,7 +746,7 @@
           <w:color w:val="505050"/>
           <w:sz w:val="20"/>
         </w:rPr>
-        <w:t>practica7_05_paginacion_pagina2.png</w:t>
+        <w:t>Figura 5. Navegacion a la pagina 2.</w:t>
       </w:r>
     </w:p>
     <w:p>
@@ -770,7 +770,7 @@
         <w:rPr>
           <w:rFonts w:ascii="Calibri" w:hAnsi="Calibri"/>
         </w:rPr>
-        <w:t>Se abrio el detalle del producto seleccionado para verificar la ruta dinamica y la presentacion de la categoria asociada.</w:t>
+        <w:t>Se abrio el detalle del producto seleccionado para verificar la ruta dinamica y la categoria asociada.</w:t>
       </w:r>
     </w:p>
     <w:p>
@@ -782,7 +782,7 @@
         <w:drawing>
           <wp:inline xmlns:a="http://schemas.openxmlformats.org/drawingml/2006/main" xmlns:pic="http://schemas.openxmlformats.org/drawingml/2006/picture">
             <wp:extent cx="5577840" cy="6972300"/>
-            <wp:docPr id="6" name="Picture 6"/>
+            <wp:docPr id="6" name="Figura 6. Vista detallada del producto."/>
             <wp:cNvGraphicFramePr>
               <a:graphicFrameLocks noChangeAspect="1"/>
             </wp:cNvGraphicFramePr>
@@ -790,7 +790,7 @@
               <a:graphicData uri="http://schemas.openxmlformats.org/drawingml/2006/picture">
                 <pic:pic>
                   <pic:nvPicPr>
-                    <pic:cNvPr id="0" name="practica7_06_detalle_producto.png"/>
+                    <pic:cNvPr id="0" name="Figura 6. Vista detallada del producto."/>
                     <pic:cNvPicPr/>
                   </pic:nvPicPr>
                   <pic:blipFill>
@@ -825,7 +825,7 @@
           <w:color w:val="505050"/>
           <w:sz w:val="20"/>
         </w:rPr>
-        <w:t>practica7_06_detalle_producto.png</w:t>
+        <w:t>Figura 6. Vista detallada del producto.</w:t>
       </w:r>
     </w:p>
     <w:p>
@@ -849,7 +849,7 @@
         <w:rPr>
           <w:rFonts w:ascii="Calibri" w:hAnsi="Calibri"/>
         </w:rPr>
-        <w:t>Se consulto el endpoint REST con filtros en la URL y se documento la respuesta JSON correcta del backend.</w:t>
+        <w:t>Se consulto el endpoint REST con filtros en la URL y se documento la respuesta JSON del backend.</w:t>
       </w:r>
     </w:p>
     <w:p>
@@ -861,7 +861,7 @@
         <w:drawing>
           <wp:inline xmlns:a="http://schemas.openxmlformats.org/drawingml/2006/main" xmlns:pic="http://schemas.openxmlformats.org/drawingml/2006/picture">
             <wp:extent cx="5577840" cy="2014220"/>
-            <wp:docPr id="7" name="Picture 7"/>
+            <wp:docPr id="7" name="Figura 7. Respuesta JSON del endpoint de productos."/>
             <wp:cNvGraphicFramePr>
               <a:graphicFrameLocks noChangeAspect="1"/>
             </wp:cNvGraphicFramePr>
@@ -869,7 +869,7 @@
               <a:graphicData uri="http://schemas.openxmlformats.org/drawingml/2006/picture">
                 <pic:pic>
                   <pic:nvPicPr>
-                    <pic:cNvPr id="0" name="practica7_07_api_json.png"/>
+                    <pic:cNvPr id="0" name="Figura 7. Respuesta JSON del endpoint de productos."/>
                     <pic:cNvPicPr/>
                   </pic:nvPicPr>
                   <pic:blipFill>
@@ -904,7 +904,7 @@
           <w:color w:val="505050"/>
           <w:sz w:val="20"/>
         </w:rPr>
-        <w:t>practica7_07_api_json.png</w:t>
+        <w:t>Figura 7. Respuesta JSON del endpoint de productos.</w:t>
       </w:r>
     </w:p>
     <w:p>

</xml_diff>

<commit_message>
docs(practica7): limpiar textos y evidencias
</commit_message>
<xml_diff>
--- a/practica7/evidencias/Reporte_Practica_07_Paginacion_Filtros.docx
+++ b/practica7/evidencias/Reporte_Practica_07_Paginacion_Filtros.docx
@@ -386,7 +386,7 @@
       <w:r>
         <w:drawing>
           <wp:inline xmlns:a="http://schemas.openxmlformats.org/drawingml/2006/main" xmlns:pic="http://schemas.openxmlformats.org/drawingml/2006/picture">
-            <wp:extent cx="5577840" cy="10268648"/>
+            <wp:extent cx="5577840" cy="9277032"/>
             <wp:docPr id="1" name="Figura 1. Catalogo inicial de productos."/>
             <wp:cNvGraphicFramePr>
               <a:graphicFrameLocks noChangeAspect="1"/>
@@ -407,7 +407,7 @@
                   <pic:spPr>
                     <a:xfrm>
                       <a:off x="0" y="0"/>
-                      <a:ext cx="5577840" cy="10268648"/>
+                      <a:ext cx="5577840" cy="9277032"/>
                     </a:xfrm>
                     <a:prstGeom prst="rect"/>
                   </pic:spPr>
@@ -454,7 +454,7 @@
         <w:rPr>
           <w:rFonts w:ascii="Calibri" w:hAnsi="Calibri"/>
         </w:rPr>
-        <w:t>El campo de busqueda contiene el termino 'ab' y el listado se reduce al producto correspondiente.</w:t>
+        <w:t>El campo de busqueda contiene el termino 'Laptop' y el listado se reduce a los resultados relacionados.</w:t>
       </w:r>
     </w:p>
     <w:p>
@@ -465,7 +465,7 @@
       <w:r>
         <w:drawing>
           <wp:inline xmlns:a="http://schemas.openxmlformats.org/drawingml/2006/main" xmlns:pic="http://schemas.openxmlformats.org/drawingml/2006/picture">
-            <wp:extent cx="5577840" cy="10144696"/>
+            <wp:extent cx="5577840" cy="6972300"/>
             <wp:docPr id="2" name="Figura 2. Resultado de busqueda por texto."/>
             <wp:cNvGraphicFramePr>
               <a:graphicFrameLocks noChangeAspect="1"/>
@@ -486,7 +486,7 @@
                   <pic:spPr>
                     <a:xfrm>
                       <a:off x="0" y="0"/>
-                      <a:ext cx="5577840" cy="10144696"/>
+                      <a:ext cx="5577840" cy="6972300"/>
                     </a:xfrm>
                     <a:prstGeom prst="rect"/>
                   </pic:spPr>
@@ -544,7 +544,7 @@
       <w:r>
         <w:drawing>
           <wp:inline xmlns:a="http://schemas.openxmlformats.org/drawingml/2006/main" xmlns:pic="http://schemas.openxmlformats.org/drawingml/2006/picture">
-            <wp:extent cx="5577840" cy="9939401"/>
+            <wp:extent cx="5577840" cy="9071737"/>
             <wp:docPr id="3" name="Figura 3. Aplicacion de filtro por categoria."/>
             <wp:cNvGraphicFramePr>
               <a:graphicFrameLocks noChangeAspect="1"/>
@@ -565,7 +565,7 @@
                   <pic:spPr>
                     <a:xfrm>
                       <a:off x="0" y="0"/>
-                      <a:ext cx="5577840" cy="9939401"/>
+                      <a:ext cx="5577840" cy="9071737"/>
                     </a:xfrm>
                     <a:prstGeom prst="rect"/>
                   </pic:spPr>
@@ -702,7 +702,7 @@
       <w:r>
         <w:drawing>
           <wp:inline xmlns:a="http://schemas.openxmlformats.org/drawingml/2006/main" xmlns:pic="http://schemas.openxmlformats.org/drawingml/2006/picture">
-            <wp:extent cx="5577840" cy="10020744"/>
+            <wp:extent cx="5577840" cy="9277032"/>
             <wp:docPr id="5" name="Figura 5. Navegacion a la pagina 2."/>
             <wp:cNvGraphicFramePr>
               <a:graphicFrameLocks noChangeAspect="1"/>
@@ -723,7 +723,7 @@
                   <pic:spPr>
                     <a:xfrm>
                       <a:off x="0" y="0"/>
-                      <a:ext cx="5577840" cy="10020744"/>
+                      <a:ext cx="5577840" cy="9277032"/>
                     </a:xfrm>
                     <a:prstGeom prst="rect"/>
                   </pic:spPr>
@@ -860,7 +860,7 @@
       <w:r>
         <w:drawing>
           <wp:inline xmlns:a="http://schemas.openxmlformats.org/drawingml/2006/main" xmlns:pic="http://schemas.openxmlformats.org/drawingml/2006/picture">
-            <wp:extent cx="5577840" cy="2014220"/>
+            <wp:extent cx="5577840" cy="6972300"/>
             <wp:docPr id="7" name="Figura 7. Respuesta JSON del endpoint de productos."/>
             <wp:cNvGraphicFramePr>
               <a:graphicFrameLocks noChangeAspect="1"/>
@@ -881,7 +881,7 @@
                   <pic:spPr>
                     <a:xfrm>
                       <a:off x="0" y="0"/>
-                      <a:ext cx="5577840" cy="2014220"/>
+                      <a:ext cx="5577840" cy="6972300"/>
                     </a:xfrm>
                     <a:prstGeom prst="rect"/>
                   </pic:spPr>

</xml_diff>